<commit_message>
add license for RadioTime searches
</commit_message>
<xml_diff>
--- a/RadioGalaxy/RadioGalaxy/licenses.docx
+++ b/RadioGalaxy/RadioGalaxy/licenses.docx
@@ -195,19 +195,7 @@
           <w:rPr>
             <w:rStyle w:val="Hyperlink"/>
           </w:rPr>
-          <w:t>https://www.shoutcast.com/lega</w:t>
-        </w:r>
-        <w:r>
-          <w:rPr>
-            <w:rStyle w:val="Hyperlink"/>
-          </w:rPr>
-          <w:t>l</w:t>
-        </w:r>
-        <w:r>
-          <w:rPr>
-            <w:rStyle w:val="Hyperlink"/>
-          </w:rPr>
-          <w:t>/agreements/api</w:t>
+          <w:t>https://www.shoutcast.com/legal/agreements/api</w:t>
         </w:r>
       </w:hyperlink>
       <w:r>
@@ -414,6 +402,81 @@
         <w:t xml:space="preserve"> the right to provide their metadata in their directory service.</w:t>
       </w:r>
     </w:p>
+    <w:p>
+      <w:pPr>
+        <w:pStyle w:val="Heading1"/>
+      </w:pPr>
+      <w:r>
+        <w:t>Directory RadioTime.com</w:t>
+      </w:r>
+    </w:p>
+    <w:p>
+      <w:r>
+        <w:t xml:space="preserve">The </w:t>
+      </w:r>
+      <w:proofErr w:type="spellStart"/>
+      <w:r>
+        <w:t>RadioTime</w:t>
+      </w:r>
+      <w:proofErr w:type="spellEnd"/>
+      <w:r>
+        <w:t xml:space="preserve"> end user license can be found at </w:t>
+      </w:r>
+      <w:hyperlink r:id="rId10" w:history="1">
+        <w:r>
+          <w:rPr>
+            <w:rStyle w:val="Hyperlink"/>
+          </w:rPr>
+          <w:t>https://privacy.tunein.com/policies/en/?name=end-user-license-agreement-terms-of-service</w:t>
+        </w:r>
+      </w:hyperlink>
+      <w:r>
+        <w:t xml:space="preserve">. </w:t>
+      </w:r>
+    </w:p>
+    <w:p>
+      <w:r>
+        <w:t>The key paragraph include:</w:t>
+      </w:r>
+    </w:p>
+    <w:p>
+      <w:pPr>
+        <w:ind w:left="720"/>
+      </w:pPr>
+      <w:r>
+        <w:t>Subject to your complete and ongoing compliance with this EULA, TuneIn hereby grants you a revocable, non-exclusive, non-transferable, non-sublicensable, royalty-free and worldwide right and license to: (a) install and use one object code copy of any mobile or other downloadable application associated with the Service obtained from a legitimate marketplace (whether installed by you or pre-installed on your mobile device by the device manufacturer or a wireless telephone provider) on a mobile device that you own or control; and (b) access and use the Service, solely for your personal, non-commercial entertainment use as intended through the provided functionality of the Service and solely in strict compliance with the provisions of this EULA.</w:t>
+      </w:r>
+    </w:p>
+    <w:p>
+      <w:r>
+        <w:t xml:space="preserve">In the license for </w:t>
+      </w:r>
+      <w:r>
+        <w:t>transmitting entities includes a grant of rights to use the station’s information:</w:t>
+      </w:r>
+    </w:p>
+    <w:p>
+      <w:pPr>
+        <w:ind w:left="720"/>
+      </w:pPr>
+      <w:r>
+        <w:t xml:space="preserve">License to Your Marks. You grant TuneIn and its agents, subsidiaries, affiliates, licensees, successors, and assigns a sublicensable, royalty-free, nonexclusive, worldwide and fully paid-up license to reproduce, distribute, publicly display, publicly perform, transmit, communicate to the public, resize, and otherwise use and exploit (collectively “Use”) during the term of these Terms any of your slogans, logos, trademarks, and/or service marks (collectively, “Marks”) that you upload to the Sign-Up Page or otherwise make available to TuneIn, to advertise, market and </w:t>
+      </w:r>
+      <w:r>
+        <w:lastRenderedPageBreak/>
+        <w:t xml:space="preserve">promote your Feed and the availability of your Feed on or off of the Service in any and all media now known or hereafter devised. TuneIn will Use your Marks in accordance with any reasonable guidelines or other instructions that you </w:t>
+      </w:r>
+      <w:proofErr w:type="gramStart"/>
+      <w:r>
+        <w:t>enter into</w:t>
+      </w:r>
+      <w:proofErr w:type="gramEnd"/>
+      <w:r>
+        <w:t xml:space="preserve"> the fields provided on the Sign-Up Page.</w:t>
+      </w:r>
+    </w:p>
+    <w:p/>
+    <w:p/>
     <w:p/>
     <w:sectPr>
       <w:pgSz w:w="12240" w:h="15840"/>
@@ -1614,6 +1677,17 @@
       <w:u w:val="single"/>
     </w:rPr>
   </w:style>
+  <w:style w:type="character" w:styleId="Strong">
+    <w:name w:val="Strong"/>
+    <w:basedOn w:val="DefaultParagraphFont"/>
+    <w:uiPriority w:val="22"/>
+    <w:qFormat/>
+    <w:rsid w:val="00744BFA"/>
+    <w:rPr>
+      <w:b/>
+      <w:bCs/>
+    </w:rPr>
+  </w:style>
 </w:styles>
 </file>
 

</xml_diff>

<commit_message>
implement flag to turn off animation to save power when using app on screen
</commit_message>
<xml_diff>
--- a/RadioGalaxy/RadioGalaxy/licenses.docx
+++ b/RadioGalaxy/RadioGalaxy/licenses.docx
@@ -12,7 +12,13 @@
       </w:r>
       <w:proofErr w:type="spellEnd"/>
       <w:r>
-        <w:t xml:space="preserve"> app uses two radio station directories: </w:t>
+        <w:t xml:space="preserve"> app uses </w:t>
+      </w:r>
+      <w:r>
+        <w:t>three</w:t>
+      </w:r>
+      <w:r>
+        <w:t xml:space="preserve"> radio station directories: </w:t>
       </w:r>
       <w:r>
         <w:rPr>
@@ -22,7 +28,7 @@
         <w:t>radio-browser.info</w:t>
       </w:r>
       <w:r>
-        <w:t xml:space="preserve"> and </w:t>
+        <w:t xml:space="preserve">, </w:t>
       </w:r>
       <w:r>
         <w:rPr>
@@ -32,6 +38,23 @@
         <w:t>shoutcast.com</w:t>
       </w:r>
       <w:r>
+        <w:rPr>
+          <w:b/>
+          <w:bCs/>
+        </w:rPr>
+        <w:t xml:space="preserve"> </w:t>
+      </w:r>
+      <w:r>
+        <w:t>and</w:t>
+      </w:r>
+      <w:r>
+        <w:rPr>
+          <w:b/>
+          <w:bCs/>
+        </w:rPr>
+        <w:t xml:space="preserve"> radiotime.com</w:t>
+      </w:r>
+      <w:r>
         <w:t>.</w:t>
       </w:r>
       <w:r>
@@ -67,7 +90,19 @@
           <w:rPr>
             <w:rStyle w:val="Hyperlink"/>
           </w:rPr>
-          <w:t>https://www.radio-browser.info</w:t>
+          <w:t>https://www.radi</w:t>
+        </w:r>
+        <w:r>
+          <w:rPr>
+            <w:rStyle w:val="Hyperlink"/>
+          </w:rPr>
+          <w:t>o</w:t>
+        </w:r>
+        <w:r>
+          <w:rPr>
+            <w:rStyle w:val="Hyperlink"/>
+          </w:rPr>
+          <w:t>-browser.info</w:t>
         </w:r>
       </w:hyperlink>
       <w:r>
@@ -455,7 +490,22 @@
     </w:p>
     <w:p>
       <w:r>
-        <w:t>Note that section A above isn’t relevant as no TuneIn application is involved, but section B grants the end user the right to use the service.  Additionally, t</w:t>
+        <w:t xml:space="preserve">Note that </w:t>
+      </w:r>
+      <w:r>
+        <w:t xml:space="preserve">section </w:t>
+      </w:r>
+      <w:r>
+        <w:t>(a)</w:t>
+      </w:r>
+      <w:r>
+        <w:t xml:space="preserve"> above isn’t relevant as no TuneIn application is involved, but section </w:t>
+      </w:r>
+      <w:r>
+        <w:t>(b)</w:t>
+      </w:r>
+      <w:r>
+        <w:t xml:space="preserve"> grants the end user the right to use the service.  Additionally, t</w:t>
       </w:r>
       <w:r>
         <w:t xml:space="preserve">he license for </w:t>
@@ -467,7 +517,13 @@
         <w:t xml:space="preserve">by each station </w:t>
       </w:r>
       <w:r>
-        <w:t>of rights to use the station’s information:</w:t>
+        <w:t xml:space="preserve">of rights to use the station’s </w:t>
+      </w:r>
+      <w:r>
+        <w:t>directory and stream data</w:t>
+      </w:r>
+      <w:r>
+        <w:t>:</w:t>
       </w:r>
     </w:p>
     <w:p>
@@ -475,11 +531,11 @@
         <w:ind w:left="720"/>
       </w:pPr>
       <w:r>
-        <w:t xml:space="preserve">License to Your Marks. You grant TuneIn and its agents, subsidiaries, affiliates, licensees, successors, and assigns a sublicensable, royalty-free, nonexclusive, worldwide and fully paid-up license to reproduce, distribute, publicly display, publicly perform, transmit, communicate to the public, resize, and otherwise use and exploit (collectively “Use”) during the term of these Terms any of your slogans, logos, trademarks, and/or service marks (collectively, “Marks”) that you upload to </w:t>
+        <w:t xml:space="preserve">License to Your Marks. You grant TuneIn and its agents, subsidiaries, affiliates, licensees, successors, and assigns a sublicensable, royalty-free, nonexclusive, worldwide and fully paid-up license to reproduce, distribute, publicly display, publicly perform, transmit, communicate to the public, resize, and otherwise use and exploit (collectively “Use”) during the term of these Terms any of your slogans, </w:t>
       </w:r>
       <w:r>
         <w:lastRenderedPageBreak/>
-        <w:t xml:space="preserve">the Sign-Up Page or otherwise make available to TuneIn, to advertise, market and promote your Feed and the availability of your Feed on or off of the Service in any and all media now known or hereafter devised. TuneIn will Use your Marks in accordance with any reasonable guidelines or other instructions that you </w:t>
+        <w:t xml:space="preserve">logos, trademarks, and/or service marks (collectively, “Marks”) that you upload to the Sign-Up Page or otherwise make available to TuneIn, to advertise, market and promote your Feed and the availability of your Feed on or off of the Service in any and all media now known or hereafter devised. TuneIn will Use your Marks in accordance with any reasonable guidelines or other instructions that you </w:t>
       </w:r>
       <w:proofErr w:type="gramStart"/>
       <w:r>

</xml_diff>